<commit_message>
Deploy web SaaS version
</commit_message>
<xml_diff>
--- a/templates/CAPA_TEMPLATE.docx
+++ b/templates/CAPA_TEMPLATE.docx
@@ -727,20 +727,6 @@
         </w:rPr>
         <w:t>.</w:t>
       </w:r>
-    </w:p>
-    <w:p>
-      <w:pPr>
-        <w:spacing w:line="360" w:lineRule="auto"/>
-        <w:jc w:val="both"/>
-        <w:rPr>
-          <w:rFonts w:cs="Arial"/>
-          <w:i/>
-          <w:iCs/>
-          <w:color w:val="000000"/>
-          <w:sz w:val="23"/>
-          <w:szCs w:val="23"/>
-        </w:rPr>
-      </w:pPr>
     </w:p>
     <w:p>
       <w:pPr>

</xml_diff>